<commit_message>
Satin 4 feedback: tighten the live-keyword, above-bound and restart wording
- Every live keyword is priced in both waves: 27 of the 290 campaigns
  going to 900% hold more than one live keyword (44 beside the first);
  example moved to the live "queen size silk sheets" campaign.
- Name the paused keywords (not campaigns) that get no write.
- Above-bound: 8 flags in live campaigns plus 1 in the paused Twin exact
  this plan restarts.
- List the 8 paused campaigns the revive rule restarts, including
  "king satin sheet set" in wave 1.

Co-Authored-By: Claude Opus 5.5 <noreply@anthropic.com>
Claude-Session: https://claude.ai/code/session_01YNgDp4Dr6K8rA49jFuXt44
</commit_message>
<xml_diff>
--- a/satin_deliverables/Satin4_US_audit_20260929_feedback.docx
+++ b/satin_deliverables/Satin4_US_audit_20260929_feedback.docx
@@ -75,7 +75,7 @@
         <w:t xml:space="preserve">effective bid</w:t>
       </w:r>
       <w:r>
-        <w:t xml:space="preserve"> (base × (1 + boost)), not the cost per click. Down-only bidding pays at or below the bid, so a bid set at the average cost per click loses the auctions that clear above it; on 20 ranking keywords a cost-per-click price would have cut the bid by 4–90% ("king size silk sheets" $4.60 → $3.40, "satin bed sheets full" $4.56 → $3.20). Every live keyword in those campaigns gets a base; left at today's base, a keyword would bid 10 times today at the top. Where the engine flags a ranking bid above its market bound (the campaign's own 90-day top-of-search cost per click + 15%), it is held, not cut, and left to Joseph, as the engine itself does. The engine flags 4 live ranking keywords and the paused Twin exact this plan restarts; it flags 4 more keywords outside the ranking set, which come down to the bound (Section 3.1). The setting goes out in two waves: the 70 ranking campaigns now, the 220 other exact campaigns after the 16 Oct read.</w:t>
+        <w:t xml:space="preserve"> (base × (1 + boost)), not the cost per click. Down-only bidding pays at or below the bid, so a bid set at the average cost per click loses the auctions that clear above it; on 20 ranking keywords a cost-per-click price would have cut the bid by 4–90% ("king size silk sheets" $4.60 → $3.40, "satin bed sheets full" $4.56 → $3.20). Every live keyword in those campaigns gets a base; left at today's base, a keyword would bid 10 times today at the top. Where the engine flags a ranking bid above its market bound (the campaign's own 90-day top-of-search cost per click + 15%), it is held, not cut, and left to Joseph, as the engine itself does. The engine flags 9: 4 live ranking keywords, 1 in the paused Twin exact this plan restarts, and 4 outside the ranking set, which come down to the bound (Section 3.1). The setting goes out in two waves: the 70 ranking campaigns now, the 220 other exact campaigns after the 16 Oct read.</w:t>
       </w:r>
     </w:p>
     <w:p>
@@ -1966,10 +1966,10 @@
           <w:b/>
           <w:bCs/>
         </w:rPr>
-        <w:t xml:space="preserve">Every live keyword is priced, not only the campaign's main keyword.</w:t>
-      </w:r>
-      <w:r>
-        <w:t xml:space="preserve"> In 4 wave-1 campaigns 14 live keywords sit beside the main one (in two of them the main keyword is paused). Left at today's base, at 900% those would bid 10 times today at the top (for example "king satin sheets set" in the "king satin sheet set" campaign: $2.35 base, $23.50 at the top). The workbook gives each its effective bid ÷ 10. Paused keywords get no write.</w:t>
+        <w:t xml:space="preserve">Every live keyword is priced, not only the campaign's main keyword, in both waves.</w:t>
+      </w:r>
+      <w:r>
+        <w:t xml:space="preserve"> Of the 290 campaigns going to 900%, 27 hold more than one live keyword (44 beside the first). Left at today's base, each would bid 10 times that base at the top: in the "queen size silk sheets" campaign, "queen satin sheets" at $1.99 would go to $19.90, and four zero-click keywords at $0.50 would each go to $5.00. The workbook gives every live keyword its own base (wave 1 in the bid column, wave 2 in the wave 2 setting column). Paused keywords get no write: "silk sheet" in the live "queen sheet silk" campaign and "king size sheets set silk" in the live "king size satin sheets with elastic" campaign stay paused (Section 5).</w:t>
       </w:r>
     </w:p>
     <w:p>
@@ -1985,10 +1985,10 @@
           <w:b/>
           <w:bCs/>
         </w:rPr>
-        <w:t xml:space="preserve">The engine flags 9 keywords above its market bound.</w:t>
-      </w:r>
-      <w:r>
-        <w:t xml:space="preserve"> It neither climbs nor cuts them and marks each one for a person (team document §6 / §8). The ranking ones are held for Joseph; the others come down to the bound for him to confirm:</w:t>
+        <w:t xml:space="preserve">The engine flags 9 keywords above its market bound: 8 in live campaigns and 1 in the paused Twin exact this plan restarts</w:t>
+      </w:r>
+      <w:r>
+        <w:t xml:space="preserve"> (the audit lists that one as held because its campaign is paused). It neither climbs nor cuts them and marks each one for a person (team document §6 / §8). The ranking ones are held for Joseph; the others come down to the bound for him to confirm:</w:t>
       </w:r>
     </w:p>
     <w:tbl>
@@ -16729,7 +16729,7 @@
         <w:t xml:space="preserve">Revives</w:t>
       </w:r>
       <w:r>
-        <w:t xml:space="preserve">: revive a paused campaign only if it owns a ranking term or clears an LTSF colour, and start it at the top-of-search-only setting or at its break-even. The other audit revives stay paused: every one ran above break-even over 90 days.</w:t>
+        <w:t xml:space="preserve">: 8 paused campaigns restart under this rule: 6 ranking owners in wave 1 ("satin bed sheets", "queen satin sheet set", "satin queen sheets", "full size sheets silk", "king satin sheet set", "satin sheets full") and 2 LTSF colour campaigns in wave 2 ("grey satin sheets", "grey silk sheets"), plus the "silk twin bed sheets" exact after its listing check (Section 3.7). Revive a paused campaign only if it owns a ranking term or clears an LTSF colour, and start it at the top-of-search-only setting or at its break-even. The other audit revives stay paused: every one ran above break-even over 90 days.</w:t>
       </w:r>
     </w:p>
     <w:p>

</xml_diff>

<commit_message>
Satin 4 feedback: say where each above-bound flag sits in the audit exports
All 9 flags are in the audit JSON; 7 also appear in the Excel export's
Rationale tab. "king silk sheet set" (seq 16) and "silk twin bed
sheets" (seq 76, 79) are only in the JSON's held rows.

Co-Authored-By: Claude Opus 5.5 <noreply@anthropic.com>
Claude-Session: https://claude.ai/code/session_01YNgDp4Dr6K8rA49jFuXt44
</commit_message>
<xml_diff>
--- a/satin_deliverables/Satin4_US_audit_20260929_feedback.docx
+++ b/satin_deliverables/Satin4_US_audit_20260929_feedback.docx
@@ -1988,7 +1988,7 @@
         <w:t xml:space="preserve">The engine flags 9 keywords above its market bound: 8 in live campaigns and 1 in the paused Twin exact this plan restarts</w:t>
       </w:r>
       <w:r>
-        <w:t xml:space="preserve"> (the audit lists that one as held because its campaign is paused). It neither climbs nor cuts them and marks each one for a person (team document §6 / §8). The ranking ones are held for Joseph; the others come down to the bound for him to confirm:</w:t>
+        <w:t xml:space="preserve"> (it sits in the audit's held rows, because the campaign is paused and the engine writes nothing to it). It neither climbs nor cuts them and marks each one for a person (team document §6 / §8). The ranking ones are held for Joseph; the others come down to the bound for him to confirm:</w:t>
       </w:r>
     </w:p>
     <w:tbl>
@@ -3647,6 +3647,18 @@
       </w:tr>
     </w:tbl>
     <w:p/>
+    <w:p>
+      <w:pPr>
+        <w:spacing w:after="120"/>
+      </w:pPr>
+      <w:r>
+        <w:rPr>
+          <w:i/>
+          <w:iCs/>
+        </w:rPr>
+        <w:t xml:space="preserve">Where to find each flag: all 9 are in the audit's JSON export as "ABOVE THE MARKET BOUND … human-mandatory". Seven also appear in the Excel export's Rationale tab. "king silk sheet set" (seq 16) and "silk twin bed sheets" (seq 76 and 79) are only in the JSON's held rows ("considered"), because the engine held those rows without writing them.</w:t>
+      </w:r>
+    </w:p>
     <w:p>
       <w:pPr>
         <w:pStyle w:val="ListParagraph"/>

</xml_diff>